<commit_message>
Adiciona video de ate 5 minutos filtros de escolas e prioridades
</commit_message>
<xml_diff>
--- a/PRD – Escola SP Conecta.docx
+++ b/PRD – Escola SP Conecta.docx
@@ -224,6 +224,24 @@
         <w:rPr>
           <w:b/>
         </w:rPr>
+        <w:t xml:space="preserve">Disciplinas de interesse: </w:t>
+      </w:r>
+      <w:r>
+        <w:t>escolhe ao menos uma disciplina que deseja lecionar entre as habilitadas e correlatas da sua formação. Não pode adicionar uma disciplina fora dessa lista.</w:t>
+      </w:r>
+    </w:p>
+    <w:p>
+      <w:pPr>
+        <w:pStyle w:val="ListParagraph"/>
+        <w:numPr>
+          <w:ilvl w:val="0"/>
+          <w:numId w:val="3"/>
+        </w:numPr>
+      </w:pPr>
+      <w:r>
+        <w:rPr>
+          <w:b/>
+        </w:rPr>
         <w:t>Foto:</w:t>
       </w:r>
       <w:r>
@@ -278,10 +296,10 @@
         <w:rPr>
           <w:b/>
         </w:rPr>
-        <w:t>Vídeo:</w:t>
-      </w:r>
-      <w:r>
-        <w:t xml:space="preserve"> informa o link do YouTube (não listado), com validação do link e duração máxima de 5 minutos.</w:t>
+        <w:t xml:space="preserve">Vídeo: </w:t>
+      </w:r>
+      <w:r>
+        <w:t>informa o link de um vídeo não listado no YouTube e sua duração em mm:ss. O envio aceita de 00:01 a 05:00. Neste protótipo, a duração é declarada pelo professor; a verificação automática do vídeo e da privacidade depende de integração com o YouTube.</w:t>
       </w:r>
     </w:p>
     <w:p>
@@ -299,7 +317,7 @@
         <w:t xml:space="preserve">Escolha de escolas: </w:t>
       </w:r>
       <w:r>
-        <w:t>seleciona de 1 a 20 escolas de qualquer diretoria.</w:t>
+        <w:t>seleciona de 1 a 20 escolas de qualquer diretoria e define a ordem de prioridade.</w:t>
       </w:r>
     </w:p>
     <w:p>
@@ -317,7 +335,7 @@
         <w:t xml:space="preserve">Revisão e envio: </w:t>
       </w:r>
       <w:r>
-        <w:t>vê a prévia do mini currículo, o total de respostas de fit preenchidas e confirma o envio. Se as 10 respostas estiverem completas no rascunho, o envio as registra. Se faltar alguma, o usuário pode voltar por Editar fit cultural.</w:t>
+        <w:t>vê a prévia do mini currículo, as disciplinas escolhidas, a duração informada do vídeo e o total de respostas de fit preenchidas. Se as 10 respostas estiverem completas no rascunho, o envio as registra. Se faltar alguma, o usuário pode voltar por Editar fit cultural.</w:t>
       </w:r>
     </w:p>
     <w:p>
@@ -356,7 +374,13 @@
         </w:numPr>
       </w:pPr>
       <w:r>
-        <w:t>Filtros: diretoria, município, nome/código da escola, tipo (PEI/regular)</w:t>
+        <w:rPr>
+          <w:b/>
+        </w:rPr>
+        <w:t xml:space="preserve">Filtros: </w:t>
+      </w:r>
+      <w:r>
+        <w:t>diretoria, município, escola, PEI (sim/não) e etapa de ensino (anos finais do Ensino Fundamental, Ensino Médio e EJA no protótipo)</w:t>
       </w:r>
     </w:p>
     <w:p>
@@ -368,7 +392,13 @@
         </w:numPr>
       </w:pPr>
       <w:r>
-        <w:t>Grid padrão SED com: código, escola, diretoria, município, PEI (sim/não), ação Adicionar</w:t>
+        <w:rPr>
+          <w:b/>
+        </w:rPr>
+        <w:t xml:space="preserve">Grid padrão SED com: </w:t>
+      </w:r>
+      <w:r>
+        <w:t>código, escola, diretoria, município, PEI (sim/não), etapas de ensino e ação Adicionar</w:t>
       </w:r>
     </w:p>
     <w:p>
@@ -380,7 +410,7 @@
         </w:numPr>
       </w:pPr>
       <w:r>
-        <w:t>Lista "Minhas escolas" com opção de remover</w:t>
+        <w:t>Lista "Minhas escolas" numerada por prioridade, com ações Subir, Descer e Remover; a posição 1 é a maior prioridade</w:t>
       </w:r>
     </w:p>
     <w:p>
@@ -417,6 +447,18 @@
       </w:pPr>
       <w:r>
         <w:t>Escolas PEI só aparecem habilitadas se o professor for credenciado para PEI</w:t>
+      </w:r>
+    </w:p>
+    <w:p>
+      <w:pPr>
+        <w:pStyle w:val="ListParagraph"/>
+        <w:numPr>
+          <w:ilvl w:val="0"/>
+          <w:numId w:val="4"/>
+        </w:numPr>
+      </w:pPr>
+      <w:r>
+        <w:t>O diretor não vê a lista completa de escolas escolhidas nem a ordem de prioridade do professor</w:t>
       </w:r>
     </w:p>
     <w:p>
@@ -486,7 +528,7 @@
           </w:tcPr>
           <w:p>
             <w:r>
-              <w:t>Faltam foto, 10 respostas de fit registradas, vídeo ou ao menos uma escola</w:t>
+              <w:t>Faltam foto, uma disciplina de interesse, 10 respostas de fit registradas, vídeo de até 5 minutos ou ao menos uma escola</w:t>
             </w:r>
           </w:p>
         </w:tc>
@@ -616,6 +658,30 @@
       </w:pPr>
       <w:r>
         <w:t>Durante o prazo, pode editar foto, comentário, vídeo e escolas; as respostas de fit ficam bloqueadas após o registro das 10 perguntas</w:t>
+      </w:r>
+    </w:p>
+    <w:p>
+      <w:pPr>
+        <w:pStyle w:val="ListParagraph"/>
+        <w:numPr>
+          <w:ilvl w:val="0"/>
+          <w:numId w:val="5"/>
+        </w:numPr>
+      </w:pPr>
+      <w:r>
+        <w:t>Pode alterar as disciplinas de interesse somente entre as compatíveis com sua formação</w:t>
+      </w:r>
+    </w:p>
+    <w:p>
+      <w:pPr>
+        <w:pStyle w:val="ListParagraph"/>
+        <w:numPr>
+          <w:ilvl w:val="0"/>
+          <w:numId w:val="5"/>
+        </w:numPr>
+      </w:pPr>
+      <w:r>
+        <w:t>Pode reordenar as escolas escolhidas; essa prioridade é privada para o professor</w:t>
       </w:r>
     </w:p>
     <w:p>
@@ -927,20 +993,18 @@
             <w:tcW w:w="4680" w:type="dxa"/>
           </w:tcPr>
           <w:p>
-            <w:pPr/>
-            <w:r>
-              <w:t xml:space="preserve">Disciplinas habilitadas</w:t>
-            </w:r>
-          </w:p>
-        </w:tc>
-        <w:tc>
-          <w:tcPr>
-            <w:tcW w:w="4680" w:type="dxa"/>
-          </w:tcPr>
-          <w:p>
-            <w:pPr/>
-            <w:r>
-              <w:t xml:space="preserve">Destacar as aderentes à necessidade da escola</w:t>
+            <w:r>
+              <w:t>Disciplinas de interesse</w:t>
+            </w:r>
+          </w:p>
+        </w:tc>
+        <w:tc>
+          <w:tcPr>
+            <w:tcW w:w="4680" w:type="dxa"/>
+          </w:tcPr>
+          <w:p>
+            <w:r>
+              <w:t>Escolhidas pelo professor entre as habilitadas e correlatas da sua formação</w:t>
             </w:r>
           </w:p>
         </w:tc>
@@ -1164,6 +1228,18 @@
     </w:p>
     <w:p>
       <w:pPr>
+        <w:pStyle w:val="ListParagraph"/>
+        <w:numPr>
+          <w:ilvl w:val="0"/>
+          <w:numId w:val="8"/>
+        </w:numPr>
+      </w:pPr>
+      <w:r>
+        <w:t>O diretor vê as disciplinas que o professor quer lecionar, mas não vê a ordem de prioridade das escolas</w:t>
+      </w:r>
+    </w:p>
+    <w:p>
+      <w:pPr>
         <w:pStyle w:val="Heading2"/>
       </w:pPr>
       <w:r>
@@ -1278,10 +1354,10 @@
         <w:rPr>
           <w:b/>
         </w:rPr>
-        <w:t>Vídeo:</w:t>
-      </w:r>
-      <w:r>
-        <w:t xml:space="preserve"> player do YouTube incorporado, no padrão 16:9, com até 5 minutos.</w:t>
+        <w:t xml:space="preserve">Vídeo: </w:t>
+      </w:r>
+      <w:r>
+        <w:t>player do YouTube incorporado, no padrão 16:9, com a duração informada (até 5 minutos).</w:t>
       </w:r>
     </w:p>
     <w:p>
@@ -1314,6 +1390,24 @@
         <w:rPr>
           <w:b/>
         </w:rPr>
+        <w:t xml:space="preserve">Disciplinas de interesse: </w:t>
+      </w:r>
+      <w:r>
+        <w:t>seleção feita pelo professor entre as opções da sua formação, visível ao diretor.</w:t>
+      </w:r>
+    </w:p>
+    <w:p>
+      <w:pPr>
+        <w:pStyle w:val="ListParagraph"/>
+        <w:numPr>
+          <w:ilvl w:val="0"/>
+          <w:numId w:val="9"/>
+        </w:numPr>
+      </w:pPr>
+      <w:r>
+        <w:rPr>
+          <w:b/>
+        </w:rPr>
         <w:t>Fit cultural:</w:t>
       </w:r>
       <w:r>
@@ -1332,10 +1426,10 @@
         <w:rPr>
           <w:b/>
         </w:rPr>
-        <w:t>Escolas escolhidas:</w:t>
-      </w:r>
-      <w:r>
-        <w:t xml:space="preserve"> só na visão do professor.</w:t>
+        <w:t xml:space="preserve">Escolas escolhidas: </w:t>
+      </w:r>
+      <w:r>
+        <w:t>lista em ordem de prioridade, só na visão do professor.</w:t>
       </w:r>
     </w:p>
     <w:p>
@@ -1609,9 +1703,8 @@
             <w:tcW w:w="4680" w:type="dxa"/>
           </w:tcPr>
           <w:p>
-            <w:pPr/>
-            <w:r>
-              <w:t xml:space="preserve">Vídeo obrigatório via link do YouTube não listado, com até 5 minutos</w:t>
+            <w:r>
+              <w:t>Vídeo obrigatório via link do YouTube não listado, com duração de 00:01 a 05:00; no protótipo, a duração é informada pelo professor</w:t>
             </w:r>
           </w:p>
         </w:tc>
@@ -1751,7 +1844,7 @@
           </w:tcPr>
           <w:p>
             <w:r>
-              <w:t>O envio exige foto, 10 respostas completas de fit cultural, vídeo válido e ao menos uma escola; respostas completas no rascunho são registradas no envio</w:t>
+              <w:t>O envio exige foto, ao menos uma disciplina de interesse, 10 respostas completas de fit cultural, vídeo válido de até 5 minutos e ao menos uma escola; respostas completas no rascunho são registradas no envio</w:t>
             </w:r>
           </w:p>
         </w:tc>
@@ -1778,6 +1871,72 @@
           </w:p>
         </w:tc>
       </w:tr>
+      <w:tr>
+        <w:tc>
+          <w:tcPr>
+            <w:tcW w:type="dxa" w:w="4680"/>
+          </w:tcPr>
+          <w:p>
+            <w:r>
+              <w:t>RN13</w:t>
+            </w:r>
+          </w:p>
+        </w:tc>
+        <w:tc>
+          <w:tcPr>
+            <w:tcW w:type="dxa" w:w="4680"/>
+          </w:tcPr>
+          <w:p>
+            <w:r>
+              <w:t>As disciplinas de interesse devem pertencer às disciplinas habilitadas ou correlatas da formação do professor</w:t>
+            </w:r>
+          </w:p>
+        </w:tc>
+      </w:tr>
+      <w:tr>
+        <w:tc>
+          <w:tcPr>
+            <w:tcW w:type="dxa" w:w="4680"/>
+          </w:tcPr>
+          <w:p>
+            <w:r>
+              <w:t>RN14</w:t>
+            </w:r>
+          </w:p>
+        </w:tc>
+        <w:tc>
+          <w:tcPr>
+            <w:tcW w:type="dxa" w:w="4680"/>
+          </w:tcPr>
+          <w:p>
+            <w:r>
+              <w:t>O professor define e pode alterar a ordem de prioridade das escolas escolhidas; o diretor não vê essa lista nem sua ordem</w:t>
+            </w:r>
+          </w:p>
+        </w:tc>
+      </w:tr>
+      <w:tr>
+        <w:tc>
+          <w:tcPr>
+            <w:tcW w:type="dxa" w:w="4680"/>
+          </w:tcPr>
+          <w:p>
+            <w:r>
+              <w:t>RN15</w:t>
+            </w:r>
+          </w:p>
+        </w:tc>
+        <w:tc>
+          <w:tcPr>
+            <w:tcW w:type="dxa" w:w="4680"/>
+          </w:tcPr>
+          <w:p>
+            <w:r>
+              <w:t>A busca de escolas pode ser filtrada por PEI e etapa de ensino; a lista mostra esses atributos em cada escola</w:t>
+            </w:r>
+          </w:p>
+        </w:tc>
+      </w:tr>
     </w:tbl>
     <w:p>
       <w:pPr/>
@@ -1894,6 +2053,30 @@
       </w:pPr>
       <w:r>
         <w:t>☐ Calendário: prazo do professor, prazo do diretor, liberação das conexões recebidas, prazo da conexão final e divulgação do resultado</w:t>
+      </w:r>
+    </w:p>
+    <w:p>
+      <w:pPr>
+        <w:pStyle w:val="ListParagraph"/>
+        <w:numPr>
+          <w:ilvl w:val="0"/>
+          <w:numId w:val="11"/>
+        </w:numPr>
+      </w:pPr>
+      <w:r>
+        <w:t>☐ Integração com o YouTube para verificar automaticamente duração de até 5 minutos e privacidade não listada</w:t>
+      </w:r>
+    </w:p>
+    <w:p>
+      <w:pPr>
+        <w:pStyle w:val="ListParagraph"/>
+        <w:numPr>
+          <w:ilvl w:val="0"/>
+          <w:numId w:val="11"/>
+        </w:numPr>
+      </w:pPr>
+      <w:r>
+        <w:t>☐ Fonte oficial e atualização das etapas de ensino oferecidas por cada escola</w:t>
       </w:r>
     </w:p>
     <w:sectPr>

</xml_diff>

<commit_message>
Remove fit cultural do prototipo e PRD
</commit_message>
<xml_diff>
--- a/PRD – Escola SP Conecta.docx
+++ b/PRD – Escola SP Conecta.docx
@@ -260,10 +260,10 @@
         <w:rPr>
           <w:b/>
         </w:rPr>
-        <w:t xml:space="preserve">Fit cultural: </w:t>
-      </w:r>
-      <w:r>
-        <w:t>responde 10 perguntas. O rascunho é salvo durante o preenchimento; as respostas completas são registradas ao clicar em Registrar respostas ou ao avançar. Depois do registro, não podem ser editadas.</w:t>
+        <w:t>Comentário:</w:t>
+      </w:r>
+      <w:r>
+        <w:t xml:space="preserve"> escreve uma apresentação livre (sugestão: até 500 caracteres).</w:t>
       </w:r>
     </w:p>
     <w:p>
@@ -278,10 +278,10 @@
         <w:rPr>
           <w:b/>
         </w:rPr>
-        <w:t>Comentário:</w:t>
-      </w:r>
-      <w:r>
-        <w:t xml:space="preserve"> escreve uma apresentação livre (sugestão: até 500 caracteres).</w:t>
+        <w:t xml:space="preserve">Vídeo: </w:t>
+      </w:r>
+      <w:r>
+        <w:t>informa o link de um vídeo não listado no YouTube e sua duração em mm:ss. O envio aceita de 00:01 a 05:00. Neste protótipo, a duração é declarada pelo professor; a verificação automática do vídeo e da privacidade depende de integração com o YouTube.</w:t>
       </w:r>
     </w:p>
     <w:p>
@@ -296,10 +296,10 @@
         <w:rPr>
           <w:b/>
         </w:rPr>
-        <w:t xml:space="preserve">Vídeo: </w:t>
-      </w:r>
-      <w:r>
-        <w:t>informa o link de um vídeo não listado no YouTube e sua duração em mm:ss. O envio aceita de 00:01 a 05:00. Neste protótipo, a duração é declarada pelo professor; a verificação automática do vídeo e da privacidade depende de integração com o YouTube.</w:t>
+        <w:t xml:space="preserve">Escolha de escolas: </w:t>
+      </w:r>
+      <w:r>
+        <w:t>seleciona de 1 a 20 escolas de qualquer diretoria e define a ordem de prioridade.</w:t>
       </w:r>
     </w:p>
     <w:p>
@@ -314,29 +314,9 @@
         <w:rPr>
           <w:b/>
         </w:rPr>
-        <w:t xml:space="preserve">Escolha de escolas: </w:t>
-      </w:r>
-      <w:r>
-        <w:t>seleciona de 1 a 20 escolas de qualquer diretoria e define a ordem de prioridade.</w:t>
-      </w:r>
-    </w:p>
-    <w:p>
-      <w:pPr>
-        <w:pStyle w:val="ListParagraph"/>
-        <w:numPr>
-          <w:ilvl w:val="0"/>
-          <w:numId w:val="3"/>
-        </w:numPr>
-      </w:pPr>
-      <w:r>
-        <w:rPr>
-          <w:b/>
-        </w:rPr>
-        <w:t xml:space="preserve">Revisão e envio: </w:t>
-      </w:r>
-      <w:r>
-        <w:t>vê a prévia do mini currículo, as disciplinas escolhidas, a duração informada do vídeo e o total de respostas de fit preenchidas. Se as 10 respostas estiverem completas no rascunho, o envio as registra. Se faltar alguma, o usuário pode voltar por Editar fit cultural.</w:t>
-      </w:r>
+        <w:t>Revisão e envio: vê a prévia do mini currículo, as disciplinas escolhidas e a duração informada do vídeo antes de confirmar o envio.</w:t>
+      </w:r>
+      <w:r/>
     </w:p>
     <w:p>
       <w:pPr>
@@ -484,6 +464,7 @@
       <w:tr>
         <w:trPr>
           <w:tblHeader/>
+          <w:cantSplit/>
         </w:trPr>
         <w:tc>
           <w:tcPr>
@@ -511,6 +492,9 @@
         </w:tc>
       </w:tr>
       <w:tr>
+        <w:trPr>
+          <w:cantSplit/>
+        </w:trPr>
         <w:tc>
           <w:tcPr>
             <w:tcW w:w="4680" w:type="dxa"/>
@@ -528,12 +512,15 @@
           </w:tcPr>
           <w:p>
             <w:r>
-              <w:t>Faltam foto, uma disciplina de interesse, 10 respostas de fit registradas, vídeo de até 5 minutos ou ao menos uma escola</w:t>
-            </w:r>
-          </w:p>
-        </w:tc>
-      </w:tr>
-      <w:tr>
+              <w:t>Faltam foto, uma disciplina de interesse, vídeo de até 5 minutos ou ao menos uma escola</w:t>
+            </w:r>
+          </w:p>
+        </w:tc>
+      </w:tr>
+      <w:tr>
+        <w:trPr>
+          <w:cantSplit/>
+        </w:trPr>
         <w:tc>
           <w:tcPr>
             <w:tcW w:w="4680" w:type="dxa"/>
@@ -558,6 +545,9 @@
         </w:tc>
       </w:tr>
       <w:tr>
+        <w:trPr>
+          <w:cantSplit/>
+        </w:trPr>
         <w:tc>
           <w:tcPr>
             <w:tcW w:w="4680" w:type="dxa"/>
@@ -581,6 +571,9 @@
         </w:tc>
       </w:tr>
       <w:tr>
+        <w:trPr>
+          <w:cantSplit/>
+        </w:trPr>
         <w:tc>
           <w:tcPr>
             <w:tcW w:w="4680" w:type="dxa"/>
@@ -603,6 +596,9 @@
         </w:tc>
       </w:tr>
       <w:tr>
+        <w:trPr>
+          <w:cantSplit/>
+        </w:trPr>
         <w:tc>
           <w:tcPr>
             <w:tcW w:w="4680" w:type="dxa"/>
@@ -657,7 +653,7 @@
         </w:numPr>
       </w:pPr>
       <w:r>
-        <w:t>Durante o prazo, pode editar foto, comentário, vídeo e escolas; as respostas de fit ficam bloqueadas após o registro das 10 perguntas</w:t>
+        <w:t>Durante o prazo, pode editar foto, comentário, vídeo e escolas</w:t>
       </w:r>
     </w:p>
     <w:p>
@@ -868,6 +864,7 @@
       <w:tr>
         <w:trPr>
           <w:tblHeader/>
+          <w:cantSplit/>
         </w:trPr>
         <w:tc>
           <w:tcPr>
@@ -895,6 +892,9 @@
         </w:tc>
       </w:tr>
       <w:tr>
+        <w:trPr>
+          <w:cantSplit/>
+        </w:trPr>
         <w:tc>
           <w:tcPr>
             <w:tcW w:w="4680" w:type="dxa"/>
@@ -919,6 +919,9 @@
         </w:tc>
       </w:tr>
       <w:tr>
+        <w:trPr>
+          <w:cantSplit/>
+        </w:trPr>
         <w:tc>
           <w:tcPr>
             <w:tcW w:w="4680" w:type="dxa"/>
@@ -943,6 +946,9 @@
         </w:tc>
       </w:tr>
       <w:tr>
+        <w:trPr>
+          <w:cantSplit/>
+        </w:trPr>
         <w:tc>
           <w:tcPr>
             <w:tcW w:w="4680" w:type="dxa"/>
@@ -964,6 +970,9 @@
         </w:tc>
       </w:tr>
       <w:tr>
+        <w:trPr>
+          <w:cantSplit/>
+        </w:trPr>
         <w:tc>
           <w:tcPr>
             <w:tcW w:w="4680" w:type="dxa"/>
@@ -988,6 +997,9 @@
         </w:tc>
       </w:tr>
       <w:tr>
+        <w:trPr>
+          <w:cantSplit/>
+        </w:trPr>
         <w:tc>
           <w:tcPr>
             <w:tcW w:w="4680" w:type="dxa"/>
@@ -1010,6 +1022,9 @@
         </w:tc>
       </w:tr>
       <w:tr>
+        <w:trPr>
+          <w:cantSplit/>
+        </w:trPr>
         <w:tc>
           <w:tcPr>
             <w:tcW w:w="4680" w:type="dxa"/>
@@ -1034,6 +1049,9 @@
         </w:tc>
       </w:tr>
       <w:tr>
+        <w:trPr>
+          <w:cantSplit/>
+        </w:trPr>
         <w:tc>
           <w:tcPr>
             <w:tcW w:w="4680" w:type="dxa"/>
@@ -1058,6 +1076,9 @@
         </w:tc>
       </w:tr>
       <w:tr>
+        <w:trPr>
+          <w:cantSplit/>
+        </w:trPr>
         <w:tc>
           <w:tcPr>
             <w:tcW w:w="4680" w:type="dxa"/>
@@ -1079,6 +1100,9 @@
         </w:tc>
       </w:tr>
       <w:tr>
+        <w:trPr>
+          <w:cantSplit/>
+        </w:trPr>
         <w:tc>
           <w:tcPr>
             <w:tcW w:w="4680" w:type="dxa"/>
@@ -1394,24 +1418,6 @@
       </w:r>
       <w:r>
         <w:t>seleção feita pelo professor entre as opções da sua formação, visível ao diretor.</w:t>
-      </w:r>
-    </w:p>
-    <w:p>
-      <w:pPr>
-        <w:pStyle w:val="ListParagraph"/>
-        <w:numPr>
-          <w:ilvl w:val="0"/>
-          <w:numId w:val="9"/>
-        </w:numPr>
-      </w:pPr>
-      <w:r>
-        <w:rPr>
-          <w:b/>
-        </w:rPr>
-        <w:t>Fit cultural:</w:t>
-      </w:r>
-      <w:r>
-        <w:t xml:space="preserve"> as 10 perguntas com as respostas do professor, em acordeão ou cards.</w:t>
       </w:r>
     </w:p>
     <w:p>
@@ -1565,6 +1571,7 @@
       <w:tr>
         <w:trPr>
           <w:tblHeader/>
+          <w:cantSplit/>
         </w:trPr>
         <w:tc>
           <w:tcPr>
@@ -1572,8 +1579,14 @@
             <w:shd w:val="clear" w:color="auto" w:fill="F2F2F2"/>
           </w:tcPr>
           <w:p>
-            <w:pPr/>
-            <w:r>
+            <w:pPr>
+              <w:pageBreakBefore/>
+              <w:spacing w:before="0" w:after="0" w:line="240" w:lineRule="auto"/>
+            </w:pPr>
+            <w:r>
+              <w:rPr>
+                <w:sz w:val="17"/>
+              </w:rPr>
               <w:t xml:space="preserve">#</w:t>
             </w:r>
           </w:p>
@@ -1584,21 +1597,34 @@
             <w:shd w:val="clear" w:color="auto" w:fill="F2F2F2"/>
           </w:tcPr>
           <w:p>
-            <w:pPr/>
-            <w:r>
+            <w:pPr>
+              <w:spacing w:before="0" w:after="0" w:line="240" w:lineRule="auto"/>
+            </w:pPr>
+            <w:r>
+              <w:rPr>
+                <w:sz w:val="17"/>
+              </w:rPr>
               <w:t xml:space="preserve">Regra</w:t>
             </w:r>
           </w:p>
         </w:tc>
       </w:tr>
       <w:tr>
-        <w:tc>
-          <w:tcPr>
-            <w:tcW w:w="4680" w:type="dxa"/>
-          </w:tcPr>
-          <w:p>
-            <w:pPr/>
-            <w:r>
+        <w:trPr>
+          <w:cantSplit/>
+        </w:trPr>
+        <w:tc>
+          <w:tcPr>
+            <w:tcW w:w="4680" w:type="dxa"/>
+          </w:tcPr>
+          <w:p>
+            <w:pPr>
+              <w:spacing w:before="0" w:after="0" w:line="240" w:lineRule="auto"/>
+            </w:pPr>
+            <w:r>
+              <w:rPr>
+                <w:sz w:val="17"/>
+              </w:rPr>
               <w:t xml:space="preserve">RN01</w:t>
             </w:r>
           </w:p>
@@ -1608,21 +1634,34 @@
             <w:tcW w:w="4680" w:type="dxa"/>
           </w:tcPr>
           <w:p>
-            <w:pPr/>
-            <w:r>
+            <w:pPr>
+              <w:spacing w:before="0" w:after="0" w:line="240" w:lineRule="auto"/>
+            </w:pPr>
+            <w:r>
+              <w:rPr>
+                <w:sz w:val="17"/>
+              </w:rPr>
               <w:t xml:space="preserve">Participam: farol vermelho, farol amarelo indicado à não permanência, Categoria O, novíssimos, efetivos adidos e OFA adidos</w:t>
             </w:r>
           </w:p>
         </w:tc>
       </w:tr>
       <w:tr>
-        <w:tc>
-          <w:tcPr>
-            <w:tcW w:w="4680" w:type="dxa"/>
-          </w:tcPr>
-          <w:p>
-            <w:pPr/>
-            <w:r>
+        <w:trPr>
+          <w:cantSplit/>
+        </w:trPr>
+        <w:tc>
+          <w:tcPr>
+            <w:tcW w:w="4680" w:type="dxa"/>
+          </w:tcPr>
+          <w:p>
+            <w:pPr>
+              <w:spacing w:before="0" w:after="0" w:line="240" w:lineRule="auto"/>
+            </w:pPr>
+            <w:r>
+              <w:rPr>
+                <w:sz w:val="17"/>
+              </w:rPr>
               <w:t xml:space="preserve">RN02</w:t>
             </w:r>
           </w:p>
@@ -1632,21 +1671,34 @@
             <w:tcW w:w="4680" w:type="dxa"/>
           </w:tcPr>
           <w:p>
-            <w:pPr/>
-            <w:r>
+            <w:pPr>
+              <w:spacing w:before="0" w:after="0" w:line="240" w:lineRule="auto"/>
+            </w:pPr>
+            <w:r>
+              <w:rPr>
+                <w:sz w:val="17"/>
+              </w:rPr>
               <w:t xml:space="preserve">Não há entrevista nem atribuição em nível de diretoria</w:t>
             </w:r>
           </w:p>
         </w:tc>
       </w:tr>
       <w:tr>
-        <w:tc>
-          <w:tcPr>
-            <w:tcW w:w="4680" w:type="dxa"/>
-          </w:tcPr>
-          <w:p>
-            <w:pPr/>
-            <w:r>
+        <w:trPr>
+          <w:cantSplit/>
+        </w:trPr>
+        <w:tc>
+          <w:tcPr>
+            <w:tcW w:w="4680" w:type="dxa"/>
+          </w:tcPr>
+          <w:p>
+            <w:pPr>
+              <w:spacing w:before="0" w:after="0" w:line="240" w:lineRule="auto"/>
+            </w:pPr>
+            <w:r>
+              <w:rPr>
+                <w:sz w:val="17"/>
+              </w:rPr>
               <w:t xml:space="preserve">RN03</w:t>
             </w:r>
           </w:p>
@@ -1656,44 +1708,34 @@
             <w:tcW w:w="4680" w:type="dxa"/>
           </w:tcPr>
           <w:p>
-            <w:pPr/>
-            <w:r>
+            <w:pPr>
+              <w:spacing w:before="0" w:after="0" w:line="240" w:lineRule="auto"/>
+            </w:pPr>
+            <w:r>
+              <w:rPr>
+                <w:sz w:val="17"/>
+              </w:rPr>
               <w:t xml:space="preserve">Todo participante escolhe de 1 a 20 escolas, de qualquer diretoria</w:t>
             </w:r>
           </w:p>
         </w:tc>
       </w:tr>
       <w:tr>
-        <w:tc>
-          <w:tcPr>
-            <w:tcW w:w="4680" w:type="dxa"/>
-          </w:tcPr>
-          <w:p>
-            <w:pPr/>
-            <w:r>
-              <w:t xml:space="preserve">RN04</w:t>
-            </w:r>
-          </w:p>
-        </w:tc>
-        <w:tc>
-          <w:tcPr>
-            <w:tcW w:w="4680" w:type="dxa"/>
-          </w:tcPr>
-          <w:p>
-            <w:r>
-              <w:t>As 10 perguntas de fit cultural têm rascunho persistente; depois de registradas, as respostas não podem ser editadas</w:t>
-            </w:r>
-          </w:p>
-        </w:tc>
-      </w:tr>
-      <w:tr>
-        <w:tc>
-          <w:tcPr>
-            <w:tcW w:w="4680" w:type="dxa"/>
-          </w:tcPr>
-          <w:p>
-            <w:pPr/>
-            <w:r>
+        <w:trPr>
+          <w:cantSplit/>
+        </w:trPr>
+        <w:tc>
+          <w:tcPr>
+            <w:tcW w:w="4680" w:type="dxa"/>
+          </w:tcPr>
+          <w:p>
+            <w:pPr>
+              <w:spacing w:before="0" w:after="0" w:line="240" w:lineRule="auto"/>
+            </w:pPr>
+            <w:r>
+              <w:rPr>
+                <w:sz w:val="17"/>
+              </w:rPr>
               <w:t xml:space="preserve">RN05</w:t>
             </w:r>
           </w:p>
@@ -1703,20 +1745,34 @@
             <w:tcW w:w="4680" w:type="dxa"/>
           </w:tcPr>
           <w:p>
-            <w:r>
+            <w:pPr>
+              <w:spacing w:before="0" w:after="0" w:line="240" w:lineRule="auto"/>
+            </w:pPr>
+            <w:r>
+              <w:rPr>
+                <w:sz w:val="17"/>
+              </w:rPr>
               <w:t>Vídeo obrigatório via link do YouTube não listado, com duração de 00:01 a 05:00; no protótipo, a duração é informada pelo professor</w:t>
             </w:r>
           </w:p>
         </w:tc>
       </w:tr>
       <w:tr>
-        <w:tc>
-          <w:tcPr>
-            <w:tcW w:w="4680" w:type="dxa"/>
-          </w:tcPr>
-          <w:p>
-            <w:pPr/>
-            <w:r>
+        <w:trPr>
+          <w:cantSplit/>
+        </w:trPr>
+        <w:tc>
+          <w:tcPr>
+            <w:tcW w:w="4680" w:type="dxa"/>
+          </w:tcPr>
+          <w:p>
+            <w:pPr>
+              <w:spacing w:before="0" w:after="0" w:line="240" w:lineRule="auto"/>
+            </w:pPr>
+            <w:r>
+              <w:rPr>
+                <w:sz w:val="17"/>
+              </w:rPr>
               <w:t xml:space="preserve">RN06</w:t>
             </w:r>
           </w:p>
@@ -1726,21 +1782,34 @@
             <w:tcW w:w="4680" w:type="dxa"/>
           </w:tcPr>
           <w:p>
-            <w:pPr/>
-            <w:r>
+            <w:pPr>
+              <w:spacing w:before="0" w:after="0" w:line="240" w:lineRule="auto"/>
+            </w:pPr>
+            <w:r>
+              <w:rPr>
+                <w:sz w:val="17"/>
+              </w:rPr>
               <w:t xml:space="preserve">O diretor decide entre Conectar e Passar, sem justificativa</w:t>
             </w:r>
           </w:p>
         </w:tc>
       </w:tr>
       <w:tr>
-        <w:tc>
-          <w:tcPr>
-            <w:tcW w:w="4680" w:type="dxa"/>
-          </w:tcPr>
-          <w:p>
-            <w:pPr/>
-            <w:r>
+        <w:trPr>
+          <w:cantSplit/>
+        </w:trPr>
+        <w:tc>
+          <w:tcPr>
+            <w:tcW w:w="4680" w:type="dxa"/>
+          </w:tcPr>
+          <w:p>
+            <w:pPr>
+              <w:spacing w:before="0" w:after="0" w:line="240" w:lineRule="auto"/>
+            </w:pPr>
+            <w:r>
+              <w:rPr>
+                <w:sz w:val="17"/>
+              </w:rPr>
               <w:t xml:space="preserve">RN07</w:t>
             </w:r>
           </w:p>
@@ -1750,20 +1819,34 @@
             <w:tcW w:w="4680" w:type="dxa"/>
           </w:tcPr>
           <w:p>
-            <w:r>
+            <w:pPr>
+              <w:spacing w:before="0" w:after="0" w:line="240" w:lineRule="auto"/>
+            </w:pPr>
+            <w:r>
+              <w:rPr>
+                <w:sz w:val="17"/>
+              </w:rPr>
               <w:t>No protótipo, o professor vê no acompanhamento as escolas que o conectaram assim que há decisão do diretor, sem reiniciar o cadastro</w:t>
             </w:r>
           </w:p>
         </w:tc>
       </w:tr>
       <w:tr>
-        <w:tc>
-          <w:tcPr>
-            <w:tcW w:w="4680" w:type="dxa"/>
-          </w:tcPr>
-          <w:p>
-            <w:pPr/>
-            <w:r>
+        <w:trPr>
+          <w:cantSplit/>
+        </w:trPr>
+        <w:tc>
+          <w:tcPr>
+            <w:tcW w:w="4680" w:type="dxa"/>
+          </w:tcPr>
+          <w:p>
+            <w:pPr>
+              <w:spacing w:before="0" w:after="0" w:line="240" w:lineRule="auto"/>
+            </w:pPr>
+            <w:r>
+              <w:rPr>
+                <w:sz w:val="17"/>
+              </w:rPr>
               <w:t xml:space="preserve">RN08</w:t>
             </w:r>
           </w:p>
@@ -1773,20 +1856,34 @@
             <w:tcW w:w="4680" w:type="dxa"/>
           </w:tcPr>
           <w:p>
-            <w:r>
+            <w:pPr>
+              <w:spacing w:before="0" w:after="0" w:line="240" w:lineRule="auto"/>
+            </w:pPr>
+            <w:r>
+              <w:rPr>
+                <w:sz w:val="17"/>
+              </w:rPr>
               <w:t>O professor usa Conectar para finalizar com uma única escola; a conexão é definitiva e libera as demais escolas</w:t>
             </w:r>
           </w:p>
         </w:tc>
       </w:tr>
       <w:tr>
-        <w:tc>
-          <w:tcPr>
-            <w:tcW w:w="4680" w:type="dxa"/>
-          </w:tcPr>
-          <w:p>
-            <w:pPr/>
-            <w:r>
+        <w:trPr>
+          <w:cantSplit/>
+        </w:trPr>
+        <w:tc>
+          <w:tcPr>
+            <w:tcW w:w="4680" w:type="dxa"/>
+          </w:tcPr>
+          <w:p>
+            <w:pPr>
+              <w:spacing w:before="0" w:after="0" w:line="240" w:lineRule="auto"/>
+            </w:pPr>
+            <w:r>
+              <w:rPr>
+                <w:sz w:val="17"/>
+              </w:rPr>
               <w:t xml:space="preserve">RN09</w:t>
             </w:r>
           </w:p>
@@ -1796,21 +1893,34 @@
             <w:tcW w:w="4680" w:type="dxa"/>
           </w:tcPr>
           <w:p>
-            <w:pPr/>
-            <w:r>
+            <w:pPr>
+              <w:spacing w:before="0" w:after="0" w:line="240" w:lineRule="auto"/>
+            </w:pPr>
+            <w:r>
+              <w:rPr>
+                <w:sz w:val="17"/>
+              </w:rPr>
               <w:t xml:space="preserve">Escolas PEI só podem ser escolhidas por professores credenciados</w:t>
             </w:r>
           </w:p>
         </w:tc>
       </w:tr>
       <w:tr>
-        <w:tc>
-          <w:tcPr>
-            <w:tcW w:w="4680" w:type="dxa"/>
-          </w:tcPr>
-          <w:p>
-            <w:pPr/>
-            <w:r>
+        <w:trPr>
+          <w:cantSplit/>
+        </w:trPr>
+        <w:tc>
+          <w:tcPr>
+            <w:tcW w:w="4680" w:type="dxa"/>
+          </w:tcPr>
+          <w:p>
+            <w:pPr>
+              <w:spacing w:before="0" w:after="0" w:line="240" w:lineRule="auto"/>
+            </w:pPr>
+            <w:r>
+              <w:rPr>
+                <w:sz w:val="17"/>
+              </w:rPr>
               <w:t xml:space="preserve">RN10</w:t>
             </w:r>
           </w:p>
@@ -1820,20 +1930,34 @@
             <w:tcW w:w="4680" w:type="dxa"/>
           </w:tcPr>
           <w:p>
-            <w:pPr/>
-            <w:r>
+            <w:pPr>
+              <w:spacing w:before="0" w:after="0" w:line="240" w:lineRule="auto"/>
+            </w:pPr>
+            <w:r>
+              <w:rPr>
+                <w:sz w:val="17"/>
+              </w:rPr>
               <w:t xml:space="preserve">CPF exibido sempre mascarado</w:t>
             </w:r>
           </w:p>
         </w:tc>
       </w:tr>
       <w:tr>
+        <w:trPr>
+          <w:cantSplit/>
+        </w:trPr>
         <w:tc>
           <w:tcPr>
             <w:tcW w:type="dxa" w:w="4680"/>
           </w:tcPr>
           <w:p>
-            <w:r>
+            <w:pPr>
+              <w:spacing w:before="0" w:after="0" w:line="240" w:lineRule="auto"/>
+            </w:pPr>
+            <w:r>
+              <w:rPr>
+                <w:sz w:val="17"/>
+              </w:rPr>
               <w:t>RN11</w:t>
             </w:r>
           </w:p>
@@ -1843,19 +1967,34 @@
             <w:tcW w:type="dxa" w:w="4680"/>
           </w:tcPr>
           <w:p>
-            <w:r>
-              <w:t>O envio exige foto, ao menos uma disciplina de interesse, 10 respostas completas de fit cultural, vídeo válido de até 5 minutos e ao menos uma escola; respostas completas no rascunho são registradas no envio</w:t>
-            </w:r>
-          </w:p>
-        </w:tc>
-      </w:tr>
-      <w:tr>
+            <w:pPr>
+              <w:spacing w:before="0" w:after="0" w:line="240" w:lineRule="auto"/>
+            </w:pPr>
+            <w:r>
+              <w:rPr>
+                <w:sz w:val="17"/>
+              </w:rPr>
+              <w:t>O envio exige foto, ao menos uma disciplina de interesse, vídeo válido de até 5 minutos e ao menos uma escola</w:t>
+            </w:r>
+          </w:p>
+        </w:tc>
+      </w:tr>
+      <w:tr>
+        <w:trPr>
+          <w:cantSplit/>
+        </w:trPr>
         <w:tc>
           <w:tcPr>
             <w:tcW w:type="dxa" w:w="4680"/>
           </w:tcPr>
           <w:p>
-            <w:r>
+            <w:pPr>
+              <w:spacing w:before="0" w:after="0" w:line="240" w:lineRule="auto"/>
+            </w:pPr>
+            <w:r>
+              <w:rPr>
+                <w:sz w:val="17"/>
+              </w:rPr>
               <w:t>RN12</w:t>
             </w:r>
           </w:p>
@@ -1865,19 +2004,34 @@
             <w:tcW w:type="dxa" w:w="4680"/>
           </w:tcPr>
           <w:p>
-            <w:r>
+            <w:pPr>
+              <w:spacing w:before="0" w:after="0" w:line="240" w:lineRule="auto"/>
+            </w:pPr>
+            <w:r>
+              <w:rPr>
+                <w:sz w:val="17"/>
+              </w:rPr>
               <w:t>Cada decisão do diretor pertence à escola correspondente; a conexão final do professor bloqueia novas decisões no protótipo</w:t>
             </w:r>
           </w:p>
         </w:tc>
       </w:tr>
       <w:tr>
+        <w:trPr>
+          <w:cantSplit/>
+        </w:trPr>
         <w:tc>
           <w:tcPr>
             <w:tcW w:type="dxa" w:w="4680"/>
           </w:tcPr>
           <w:p>
-            <w:r>
+            <w:pPr>
+              <w:spacing w:before="0" w:after="0" w:line="240" w:lineRule="auto"/>
+            </w:pPr>
+            <w:r>
+              <w:rPr>
+                <w:sz w:val="17"/>
+              </w:rPr>
               <w:t>RN13</w:t>
             </w:r>
           </w:p>
@@ -1887,19 +2041,34 @@
             <w:tcW w:type="dxa" w:w="4680"/>
           </w:tcPr>
           <w:p>
-            <w:r>
+            <w:pPr>
+              <w:spacing w:before="0" w:after="0" w:line="240" w:lineRule="auto"/>
+            </w:pPr>
+            <w:r>
+              <w:rPr>
+                <w:sz w:val="17"/>
+              </w:rPr>
               <w:t>As disciplinas de interesse devem pertencer às disciplinas habilitadas ou correlatas da formação do professor</w:t>
             </w:r>
           </w:p>
         </w:tc>
       </w:tr>
       <w:tr>
+        <w:trPr>
+          <w:cantSplit/>
+        </w:trPr>
         <w:tc>
           <w:tcPr>
             <w:tcW w:type="dxa" w:w="4680"/>
           </w:tcPr>
           <w:p>
-            <w:r>
+            <w:pPr>
+              <w:spacing w:before="0" w:after="0" w:line="240" w:lineRule="auto"/>
+            </w:pPr>
+            <w:r>
+              <w:rPr>
+                <w:sz w:val="17"/>
+              </w:rPr>
               <w:t>RN14</w:t>
             </w:r>
           </w:p>
@@ -1909,19 +2078,34 @@
             <w:tcW w:type="dxa" w:w="4680"/>
           </w:tcPr>
           <w:p>
-            <w:r>
+            <w:pPr>
+              <w:spacing w:before="0" w:after="0" w:line="240" w:lineRule="auto"/>
+            </w:pPr>
+            <w:r>
+              <w:rPr>
+                <w:sz w:val="17"/>
+              </w:rPr>
               <w:t>O professor define e pode alterar a ordem de prioridade das escolas escolhidas; o diretor não vê essa lista nem sua ordem</w:t>
             </w:r>
           </w:p>
         </w:tc>
       </w:tr>
       <w:tr>
+        <w:trPr>
+          <w:cantSplit/>
+        </w:trPr>
         <w:tc>
           <w:tcPr>
             <w:tcW w:type="dxa" w:w="4680"/>
           </w:tcPr>
           <w:p>
-            <w:r>
+            <w:pPr>
+              <w:spacing w:before="0" w:after="0" w:line="240" w:lineRule="auto"/>
+            </w:pPr>
+            <w:r>
+              <w:rPr>
+                <w:sz w:val="17"/>
+              </w:rPr>
               <w:t>RN15</w:t>
             </w:r>
           </w:p>
@@ -1931,7 +2115,13 @@
             <w:tcW w:type="dxa" w:w="4680"/>
           </w:tcPr>
           <w:p>
-            <w:r>
+            <w:pPr>
+              <w:spacing w:before="0" w:after="0" w:line="240" w:lineRule="auto"/>
+            </w:pPr>
+            <w:r>
+              <w:rPr>
+                <w:sz w:val="17"/>
+              </w:rPr>
               <w:t>A busca de escolas pode ser filtrada por PEI e etapa de ensino; a lista mostra esses atributos em cada escola</w:t>
             </w:r>
           </w:p>
@@ -2029,18 +2219,6 @@
       </w:pPr>
       <w:r>
         <w:t>☐ Termo de consentimento de uso de imagem e vídeo (LGPD)</w:t>
-      </w:r>
-    </w:p>
-    <w:p>
-      <w:pPr>
-        <w:pStyle w:val="ListParagraph"/>
-        <w:numPr>
-          <w:ilvl w:val="0"/>
-          <w:numId w:val="11"/>
-        </w:numPr>
-      </w:pPr>
-      <w:r>
-        <w:t>☐ Definição das 10 perguntas de fit cultural</w:t>
       </w:r>
     </w:p>
     <w:p>

</xml_diff>

<commit_message>
Distribui professores automaticamente por prioridade
</commit_message>
<xml_diff>
--- a/PRD – Escola SP Conecta.docx
+++ b/PRD – Escola SP Conecta.docx
@@ -33,7 +33,8 @@
     <w:p>
       <w:pPr/>
       <w:r>
-        <w:t>A Escola SP Conecta substitui a entrevista e a atribuição em nível de diretoria por uma conexão em duas etapas: o professor monta um perfil e escolhe de 1 a 20 escolas de toda a rede; cada diretor pode conectar os professores que escolheram sua escola; por fim, o professor usa Conectar para finalizar com uma única escola entre as que o conectaram.</w:t>
+        <w:rPr/>
+        <w:t>A Escola SP Conecta substitui a entrevista e a atribuição em nível de diretoria por uma conexão em duas etapas: o professor monta um perfil e escolhe de 1 a 20 escolas de toda a rede; cada diretor pode conectar os professores que escolheram sua escola; ao encerrar o prazo dos diretores, o sistema o distribui automaticamente para a escola de maior prioridade entre as que o conectaram.</w:t>
       </w:r>
     </w:p>
     <w:p>
@@ -164,7 +165,8 @@
     <w:p>
       <w:pPr/>
       <w:r>
-        <w:t>O professor completa o perfil, escolhe de 1 a 20 escolas e acompanha as conexões recebidas. Depois do envio, voltar à visão do professor abre o acompanhamento, sem reiniciar o cadastro.</w:t>
+        <w:rPr/>
+        <w:t>O professor completa o perfil, ordena de 1 a 20 escolas por prioridade e acompanha o resultado. Depois do envio, voltar à visão do professor abre o acompanhamento, sem reiniciar o cadastro.</w:t>
       </w:r>
     </w:p>
     <w:p>
@@ -333,7 +335,7 @@
         <w:t xml:space="preserve">Acompanhamento: </w:t>
       </w:r>
       <w:r>
-        <w:t>após o envio, vê o status e as escolas que o conectaram. No protótipo, as conexões aparecem assim que o diretor decide. O professor clica em Conectar em uma única escola para finalizar.</w:t>
+        <w:t>após o envio, vê o status Em análise até o encerramento do prazo dos diretores. Nesse momento, o sistema encontra a primeira escola da sua ordem de prioridade que marcou Conectar e mostra a escola definida e a posição de prioridade. O professor não escolhe nem confirma a escola.</w:t>
       </w:r>
     </w:p>
     <w:p>
@@ -414,7 +416,8 @@
         </w:numPr>
       </w:pPr>
       <w:r>
-        <w:t>Aviso visível: "Os diretores das escolas escolhidas verão o seu perfil. Se mais de uma escola conectar com você, a decisão final é sua."</w:t>
+        <w:rPr/>
+        <w:t>Aviso visível: "Os diretores das escolas escolhidas verão o seu perfil. Ao fim do prazo dos diretores, o sistema definirá automaticamente a primeira escola da sua lista de prioridades que também conectou com você."</w:t>
       </w:r>
     </w:p>
     <w:p>
@@ -500,9 +503,8 @@
             <w:tcW w:w="4680" w:type="dxa"/>
           </w:tcPr>
           <w:p>
-            <w:pPr/>
-            <w:r>
-              <w:t xml:space="preserve">Perfil incompleto</w:t>
+            <w:r>
+              <w:t>Perfil incompleto</w:t>
             </w:r>
           </w:p>
         </w:tc>
@@ -526,98 +528,68 @@
             <w:tcW w:w="4680" w:type="dxa"/>
           </w:tcPr>
           <w:p>
-            <w:pPr/>
-            <w:r>
-              <w:t xml:space="preserve">Em análise</w:t>
-            </w:r>
-          </w:p>
-        </w:tc>
-        <w:tc>
-          <w:tcPr>
-            <w:tcW w:w="4680" w:type="dxa"/>
-          </w:tcPr>
-          <w:p>
-            <w:pPr/>
-            <w:r>
-              <w:t xml:space="preserve">Prazo dos diretores em andamento</w:t>
-            </w:r>
-          </w:p>
-        </w:tc>
-      </w:tr>
-      <w:tr>
-        <w:trPr>
-          <w:cantSplit/>
-        </w:trPr>
-        <w:tc>
-          <w:tcPr>
-            <w:tcW w:w="4680" w:type="dxa"/>
-          </w:tcPr>
-          <w:p>
-            <w:pPr/>
-            <w:r>
-              <w:t xml:space="preserve">Escolha pendente</w:t>
-            </w:r>
-          </w:p>
-        </w:tc>
-        <w:tc>
-          <w:tcPr>
-            <w:tcW w:w="4680" w:type="dxa"/>
-          </w:tcPr>
-          <w:p>
-            <w:r>
-              <w:t>Uma ou mais escolas conectaram; o professor precisa finalizar com uma</w:t>
-            </w:r>
-          </w:p>
-        </w:tc>
-      </w:tr>
-      <w:tr>
-        <w:trPr>
-          <w:cantSplit/>
-        </w:trPr>
-        <w:tc>
-          <w:tcPr>
-            <w:tcW w:w="4680" w:type="dxa"/>
-          </w:tcPr>
-          <w:p>
-            <w:r>
-              <w:t>Conexão finalizada</w:t>
-            </w:r>
-          </w:p>
-        </w:tc>
-        <w:tc>
-          <w:tcPr>
-            <w:tcW w:w="4680" w:type="dxa"/>
-          </w:tcPr>
-          <w:p>
-            <w:r>
-              <w:t>Professor conectou com uma escola</w:t>
-            </w:r>
-          </w:p>
-        </w:tc>
-      </w:tr>
-      <w:tr>
-        <w:trPr>
-          <w:cantSplit/>
-        </w:trPr>
-        <w:tc>
-          <w:tcPr>
-            <w:tcW w:w="4680" w:type="dxa"/>
-          </w:tcPr>
-          <w:p>
-            <w:pPr/>
-            <w:r>
-              <w:t xml:space="preserve">Sem conexão</w:t>
-            </w:r>
-          </w:p>
-        </w:tc>
-        <w:tc>
-          <w:tcPr>
-            <w:tcW w:w="4680" w:type="dxa"/>
-          </w:tcPr>
-          <w:p>
-            <w:pPr/>
-            <w:r>
-              <w:t xml:space="preserve">Nenhuma escola conectou (regra a definir)</w:t>
+            <w:r>
+              <w:t>Em análise</w:t>
+            </w:r>
+          </w:p>
+        </w:tc>
+        <w:tc>
+          <w:tcPr>
+            <w:tcW w:w="4680" w:type="dxa"/>
+          </w:tcPr>
+          <w:p>
+            <w:r>
+              <w:t>Perfil enviado; prazo dos diretores em andamento</w:t>
+            </w:r>
+          </w:p>
+        </w:tc>
+      </w:tr>
+      <w:tr>
+        <w:trPr>
+          <w:cantSplit/>
+        </w:trPr>
+        <w:tc>
+          <w:tcPr>
+            <w:tcW w:w="4680" w:type="dxa"/>
+          </w:tcPr>
+          <w:p>
+            <w:r>
+              <w:t>Escola definida</w:t>
+            </w:r>
+          </w:p>
+        </w:tc>
+        <w:tc>
+          <w:tcPr>
+            <w:tcW w:w="4680" w:type="dxa"/>
+          </w:tcPr>
+          <w:p>
+            <w:r>
+              <w:t>Prazo dos diretores encerrado; o sistema encontrou a escola conectada de maior prioridade</w:t>
+            </w:r>
+          </w:p>
+        </w:tc>
+      </w:tr>
+      <w:tr>
+        <w:trPr>
+          <w:cantSplit/>
+        </w:trPr>
+        <w:tc>
+          <w:tcPr>
+            <w:tcW w:w="4680" w:type="dxa"/>
+          </w:tcPr>
+          <w:p>
+            <w:r>
+              <w:t>Sem conexão</w:t>
+            </w:r>
+          </w:p>
+        </w:tc>
+        <w:tc>
+          <w:tcPr>
+            <w:tcW w:w="4680" w:type="dxa"/>
+          </w:tcPr>
+          <w:p>
+            <w:r>
+              <w:t>Prazo encerrado sem nenhuma escola da lista que tenha conectado o professor; regra posterior a definir</w:t>
             </w:r>
           </w:p>
         </w:tc>
@@ -713,7 +685,8 @@
         </w:numPr>
       </w:pPr>
       <w:r>
-        <w:t>No acompanhamento, vê somente as escolas que o conectaram e pode usar Conectar em apenas uma; a conexão é definitiva</w:t>
+        <w:rPr/>
+        <w:t>No acompanhamento, antes do encerramento do prazo vê Em análise; depois vê a escola definida automaticamente e a posição dela na sua lista de prioridades</w:t>
       </w:r>
     </w:p>
     <w:p>
@@ -725,7 +698,8 @@
         </w:numPr>
       </w:pPr>
       <w:r>
-        <w:t>Depois da conexão final, as demais escolas ficam indisponíveis e as decisões dos diretores são bloqueadas no protótipo</w:t>
+        <w:rPr/>
+        <w:t>A distribuição automática ocorre uma vez ao encerrar o prazo dos diretores; depois disso, as decisões dos diretores ficam bloqueadas no protótipo</w:t>
       </w:r>
     </w:p>
     <w:p>
@@ -835,10 +809,10 @@
         <w:rPr>
           <w:b/>
         </w:rPr>
-        <w:t xml:space="preserve">Acompanhamento: </w:t>
-      </w:r>
-      <w:r>
-        <w:t>vê se o professor finalizou a conexão com sua escola, escolheu outra ou ainda não concluiu.</w:t>
+        <w:t xml:space="preserve">Resultado: </w:t>
+      </w:r>
+      <w:r>
+        <w:t>após o encerramento do prazo, vê se o sistema distribuiu o professor para sua escola, para outra escola ou se não houve distribuição.</w:t>
       </w:r>
     </w:p>
     <w:p>
@@ -1217,14 +1191,10 @@
         </w:numPr>
       </w:pPr>
       <w:r>
-        <w:rPr>
-          <w:b/>
-        </w:rPr>
-        <w:t xml:space="preserve">A decisão final é do professor: </w:t>
-      </w:r>
-      <w:r>
-        <w:t>após a conexão dele, o diretor vê Conexão finalizada com sua escola ou Escolheu outra escola</w:t>
-      </w:r>
+        <w:rPr/>
+        <w:t>O sistema faz a distribuição após o encerramento do prazo: o diretor vê "Distribuído automaticamente para sua escola", "Distribuído para outra escola" ou "Sem distribuição"</w:t>
+      </w:r>
+      <w:r/>
     </w:p>
     <w:p>
       <w:pPr>
@@ -1552,9 +1522,12 @@
       </w:r>
     </w:p>
     <w:p>
-      <w:pPr/>
-      <w:r>
-        <w:t>O diretor conecta primeiro; depois o professor finaliza a conexão com uma das escolas que o conectaram. No protótipo, essa lista aparece imediatamente após a decisão do diretor; o calendário oficial de liberação continua em aberto.</w:t>
+      <w:pPr>
+        <w:keepLines/>
+      </w:pPr>
+      <w:r>
+        <w:rPr/>
+        <w:t>O diretor marca Conectar ou Passar para cada professor. Ao encerrar o prazo dos diretores, o sistema percorre a lista de escolas do professor em ordem de prioridade e define a primeira que marcou Conectar. Se a primeira não o conectou, tenta a segunda e assim por diante. Antes do encerramento, o professor vê Em análise. Se nenhuma escola o conectou, mostra Sem conexão; o encaminhamento posterior permanece em aberto.</w:t>
       </w:r>
     </w:p>
     <w:tbl>
@@ -1580,7 +1553,7 @@
           </w:tcPr>
           <w:p>
             <w:pPr>
-              <w:pageBreakBefore/>
+              <w:pageBreakBefore w:val="0"/>
               <w:spacing w:before="0" w:after="0" w:line="240" w:lineRule="auto"/>
             </w:pPr>
             <w:r>
@@ -1826,7 +1799,7 @@
               <w:rPr>
                 <w:sz w:val="17"/>
               </w:rPr>
-              <w:t>No protótipo, o professor vê no acompanhamento as escolas que o conectaram assim que há decisão do diretor, sem reiniciar o cadastro</w:t>
+              <w:t>Antes do encerramento do prazo dos diretores, o professor vê apenas Em análise; após o encerramento, vê a escola definida ou Sem conexão, sem reiniciar o cadastro</w:t>
             </w:r>
           </w:p>
         </w:tc>
@@ -1863,7 +1836,7 @@
               <w:rPr>
                 <w:sz w:val="17"/>
               </w:rPr>
-              <w:t>O professor usa Conectar para finalizar com uma única escola; a conexão é definitiva e libera as demais escolas</w:t>
+              <w:t>Ao encerrar o prazo dos diretores, o sistema define automaticamente a primeira escola da ordem de prioridade do professor que marcou Conectar; o professor não escolhe nem confirma</w:t>
             </w:r>
           </w:p>
         </w:tc>
@@ -2011,7 +1984,7 @@
               <w:rPr>
                 <w:sz w:val="17"/>
               </w:rPr>
-              <w:t>Cada decisão do diretor pertence à escola correspondente; a conexão final do professor bloqueia novas decisões no protótipo</w:t>
+              <w:t>Cada decisão do diretor pertence à escola correspondente; o encerramento do prazo executa a distribuição automática e bloqueia novas decisões no protótipo</w:t>
             </w:r>
           </w:p>
         </w:tc>
@@ -2144,9 +2117,13 @@
           <w:ilvl w:val="0"/>
           <w:numId w:val="11"/>
         </w:numPr>
-      </w:pPr>
-      <w:r>
-        <w:t>☐ Regra para professor sem nenhuma conexão</w:t>
+        <w:spacing w:before="0" w:after="0" w:line="240" w:lineRule="auto"/>
+      </w:pPr>
+      <w:r>
+        <w:rPr>
+          <w:sz w:val="18"/>
+        </w:rPr>
+        <w:t>☐ Regra posterior para professor sem distribuição automática</w:t>
       </w:r>
     </w:p>
     <w:p>
@@ -2156,9 +2133,13 @@
           <w:ilvl w:val="0"/>
           <w:numId w:val="11"/>
         </w:numPr>
-      </w:pPr>
-      <w:r>
-        <w:t>☐ Prazo do professor para conectar e regra se ele não conectar</w:t>
+        <w:spacing w:before="0" w:after="0" w:line="240" w:lineRule="auto"/>
+      </w:pPr>
+      <w:r>
+        <w:rPr>
+          <w:sz w:val="18"/>
+        </w:rPr>
+        <w:t>☐ Limite de conexões por diretor (igual ao nº de vagas ou acima)</w:t>
       </w:r>
     </w:p>
     <w:p>
@@ -2168,9 +2149,13 @@
           <w:ilvl w:val="0"/>
           <w:numId w:val="11"/>
         </w:numPr>
-      </w:pPr>
-      <w:r>
-        <w:t>☐ Limite de conexões por diretor (igual ao nº de vagas ou acima)</w:t>
+        <w:spacing w:before="0" w:after="0" w:line="240" w:lineRule="auto"/>
+      </w:pPr>
+      <w:r>
+        <w:rPr>
+          <w:sz w:val="18"/>
+        </w:rPr>
+        <w:t>☐ Rodadas: haverá segunda rodada para vagas que sobrarem após as conexões finais?</w:t>
       </w:r>
     </w:p>
     <w:p>
@@ -2180,9 +2165,13 @@
           <w:ilvl w:val="0"/>
           <w:numId w:val="11"/>
         </w:numPr>
-      </w:pPr>
-      <w:r>
-        <w:t>☐ Rodadas: haverá segunda rodada para vagas que sobrarem após as conexões finais?</w:t>
+        <w:spacing w:before="0" w:after="0" w:line="240" w:lineRule="auto"/>
+      </w:pPr>
+      <w:r>
+        <w:rPr>
+          <w:sz w:val="18"/>
+        </w:rPr>
+        <w:t>☐ Prioridade legal entre categorias (efetivo antes de OFA/O)</w:t>
       </w:r>
     </w:p>
     <w:p>
@@ -2192,9 +2181,13 @@
           <w:ilvl w:val="0"/>
           <w:numId w:val="11"/>
         </w:numPr>
-      </w:pPr>
-      <w:r>
-        <w:t>☐ Prioridade legal entre categorias (efetivo antes de OFA/O)</w:t>
+        <w:spacing w:before="0" w:after="0" w:line="240" w:lineRule="auto"/>
+      </w:pPr>
+      <w:r>
+        <w:rPr>
+          <w:sz w:val="18"/>
+        </w:rPr>
+        <w:t>☐ Validação jurídica: sem justificativa para farol vermelho/amarelo, exibição de idade e foto</w:t>
       </w:r>
     </w:p>
     <w:p>
@@ -2204,9 +2197,13 @@
           <w:ilvl w:val="0"/>
           <w:numId w:val="11"/>
         </w:numPr>
-      </w:pPr>
-      <w:r>
-        <w:t>☐ Validação jurídica: sem justificativa para farol vermelho/amarelo, exibição de idade e foto</w:t>
+        <w:spacing w:before="0" w:after="0" w:line="240" w:lineRule="auto"/>
+      </w:pPr>
+      <w:r>
+        <w:rPr>
+          <w:sz w:val="18"/>
+        </w:rPr>
+        <w:t>☐ Termo de consentimento de uso de imagem e vídeo (LGPD)</w:t>
       </w:r>
     </w:p>
     <w:p>
@@ -2216,9 +2213,13 @@
           <w:ilvl w:val="0"/>
           <w:numId w:val="11"/>
         </w:numPr>
-      </w:pPr>
-      <w:r>
-        <w:t>☐ Termo de consentimento de uso de imagem e vídeo (LGPD)</w:t>
+        <w:spacing w:before="0" w:after="0" w:line="240" w:lineRule="auto"/>
+      </w:pPr>
+      <w:r>
+        <w:rPr>
+          <w:sz w:val="18"/>
+        </w:rPr>
+        <w:t>☐ Calendário: prazo do professor, prazo dos diretores, execução da distribuição automática e divulgação do resultado</w:t>
       </w:r>
     </w:p>
     <w:p>
@@ -2228,9 +2229,13 @@
           <w:ilvl w:val="0"/>
           <w:numId w:val="11"/>
         </w:numPr>
-      </w:pPr>
-      <w:r>
-        <w:t>☐ Calendário: prazo do professor, prazo do diretor, liberação das conexões recebidas, prazo da conexão final e divulgação do resultado</w:t>
+        <w:spacing w:before="0" w:after="0" w:line="240" w:lineRule="auto"/>
+      </w:pPr>
+      <w:r>
+        <w:rPr>
+          <w:sz w:val="18"/>
+        </w:rPr>
+        <w:t>☐ Integração com o YouTube para verificar automaticamente duração de até 5 minutos e privacidade não listada</w:t>
       </w:r>
     </w:p>
     <w:p>
@@ -2240,20 +2245,12 @@
           <w:ilvl w:val="0"/>
           <w:numId w:val="11"/>
         </w:numPr>
-      </w:pPr>
-      <w:r>
-        <w:t>☐ Integração com o YouTube para verificar automaticamente duração de até 5 minutos e privacidade não listada</w:t>
-      </w:r>
-    </w:p>
-    <w:p>
-      <w:pPr>
-        <w:pStyle w:val="ListParagraph"/>
-        <w:numPr>
-          <w:ilvl w:val="0"/>
-          <w:numId w:val="11"/>
-        </w:numPr>
-      </w:pPr>
-      <w:r>
+        <w:spacing w:before="0" w:after="0" w:line="240" w:lineRule="auto"/>
+      </w:pPr>
+      <w:r>
+        <w:rPr>
+          <w:sz w:val="18"/>
+        </w:rPr>
         <w:t>☐ Fonte oficial e atualização das etapas de ensino oferecidas por cada escola</w:t>
       </w:r>
     </w:p>

</xml_diff>

<commit_message>
Adiciona grafico de farol ao perfil do diretor
</commit_message>
<xml_diff>
--- a/PRD – Escola SP Conecta.docx
+++ b/PRD – Escola SP Conecta.docx
@@ -1243,7 +1243,7 @@
     <w:p>
       <w:pPr/>
       <w:r>
-        <w:t>O mini currículo é um card de perfil em blocos, com o mesmo layout na prévia do professor e no detalhe do diretor. A diferença é que só o professor vê a lista das escolas que escolheu.</w:t>
+        <w:t>O mini currículo é um card de perfil em blocos. O professor vê a lista das escolas que escolheu; o diretor vê, adicionalmente, o gráfico de Avaliação Diagnóstica - Farol. A ordem de prioridade das escolas não aparece para o diretor.</w:t>
       </w:r>
     </w:p>
     <w:p>
@@ -1316,6 +1316,24 @@
       </w:r>
       <w:r>
         <w:t xml:space="preserve"> cards numéricos lado a lado com Nota final de confirmação e Nota PSS (novo).</w:t>
+      </w:r>
+    </w:p>
+    <w:p>
+      <w:pPr>
+        <w:pStyle w:val="ListParagraph"/>
+        <w:numPr>
+          <w:ilvl w:val="0"/>
+          <w:numId w:val="9"/>
+        </w:numPr>
+      </w:pPr>
+      <w:r>
+        <w:rPr>
+          <w:b/>
+        </w:rPr>
+        <w:t xml:space="preserve">Avaliação Diagnóstica - Farol (somente diretor): </w:t>
+      </w:r>
+      <w:r>
+        <w:t>gráfico de quatro barras para Parcial 2025, Final 2025, Parcial 2026 e Final 2026. Cada barra usa uma das faixas vermelho, amarelo ou verde; a altura representa a faixa qualitativa, sem nota numérica. No protótipo, o histórico é demonstrativo e a última faixa coincide com o farol atual do professor.</w:t>
       </w:r>
     </w:p>
     <w:p>
@@ -2096,6 +2114,43 @@
                 <w:sz w:val="17"/>
               </w:rPr>
               <w:t>A busca de escolas pode ser filtrada por PEI e etapa de ensino; a lista mostra esses atributos em cada escola</w:t>
+            </w:r>
+          </w:p>
+        </w:tc>
+      </w:tr>
+      <w:tr>
+        <w:trPr>
+          <w:cantSplit/>
+        </w:trPr>
+        <w:tc>
+          <w:tcPr>
+            <w:tcW w:type="dxa" w:w="4680"/>
+          </w:tcPr>
+          <w:p>
+            <w:pPr>
+              <w:spacing w:before="0" w:after="0" w:line="240" w:lineRule="auto"/>
+            </w:pPr>
+            <w:r>
+              <w:rPr>
+                <w:sz w:val="17"/>
+              </w:rPr>
+              <w:t>RN16</w:t>
+            </w:r>
+          </w:p>
+        </w:tc>
+        <w:tc>
+          <w:tcPr>
+            <w:tcW w:type="dxa" w:w="4680"/>
+          </w:tcPr>
+          <w:p>
+            <w:pPr>
+              <w:spacing w:before="0" w:after="0" w:line="240" w:lineRule="auto"/>
+            </w:pPr>
+            <w:r>
+              <w:rPr>
+                <w:sz w:val="17"/>
+              </w:rPr>
+              <w:t>O gráfico de Avaliação Diagnóstica - Farol aparece somente no mini currículo do diretor, com quatro períodos e faixas vermelho, amarelo ou verde; o histórico usado no protótipo é demonstrativo</w:t>
             </w:r>
           </w:p>
         </w:tc>

</xml_diff>

<commit_message>
Troca grafico de farol por linha
</commit_message>
<xml_diff>
--- a/PRD – Escola SP Conecta.docx
+++ b/PRD – Escola SP Conecta.docx
@@ -1333,7 +1333,7 @@
         <w:t xml:space="preserve">Avaliação Diagnóstica - Farol (somente diretor): </w:t>
       </w:r>
       <w:r>
-        <w:t>gráfico de quatro barras para Parcial 2025, Final 2025, Parcial 2026 e Final 2026. Cada barra usa uma das faixas vermelho, amarelo ou verde; a altura representa a faixa qualitativa, sem nota numérica. No protótipo, o histórico é demonstrativo e a última faixa coincide com o farol atual do professor.</w:t>
+        <w:t>gráfico de linha com quatro pontos para Parcial 2025, Final 2025, Parcial 2026 e Final 2026. A posição de cada ponto representa a faixa qualitativa vermelho, amarelo ou verde, sem nota numérica, e o próprio ponto usa a cor da sua faixa. No protótipo, o histórico é demonstrativo e a última faixa coincide com o farol atual do professor.</w:t>
       </w:r>
     </w:p>
     <w:p>
@@ -2150,7 +2150,7 @@
               <w:rPr>
                 <w:sz w:val="17"/>
               </w:rPr>
-              <w:t>O gráfico de Avaliação Diagnóstica - Farol aparece somente no mini currículo do diretor, com quatro períodos e faixas vermelho, amarelo ou verde; o histórico usado no protótipo é demonstrativo</w:t>
+              <w:t>O gráfico de Avaliação Diagnóstica - Farol aparece somente no mini currículo do diretor, como linha de quatro períodos, com cada ponto na cor da faixa vermelho, amarelo ou verde; o histórico usado no protótipo é demonstrativo</w:t>
             </w:r>
           </w:p>
         </w:tc>

</xml_diff>

<commit_message>
Combina barras e linha no farol diagnostico
</commit_message>
<xml_diff>
--- a/PRD – Escola SP Conecta.docx
+++ b/PRD – Escola SP Conecta.docx
@@ -1333,7 +1333,7 @@
         <w:t xml:space="preserve">Avaliação Diagnóstica - Farol (somente diretor): </w:t>
       </w:r>
       <w:r>
-        <w:t>gráfico de linha com quatro pontos para Parcial 2025, Final 2025, Parcial 2026 e Final 2026. A posição de cada ponto representa a faixa qualitativa vermelho, amarelo ou verde, sem nota numérica, e o próprio ponto usa a cor da sua faixa. No protótipo, o histórico é demonstrativo e a última faixa coincide com o farol atual do professor.</w:t>
+        <w:t>gráfico com quatro barras para Parcial 2025, Final 2025, Parcial 2026 e Final 2026. Uma linha liga os pontos no topo das barras para mostrar a evolução. Cada barra e seu ponto usam a cor da faixa qualitativa vermelho, amarelo ou verde, sem nota numérica. No protótipo, o histórico é demonstrativo e a última faixa coincide com o farol atual do professor.</w:t>
       </w:r>
     </w:p>
     <w:p>
@@ -2150,7 +2150,7 @@
               <w:rPr>
                 <w:sz w:val="17"/>
               </w:rPr>
-              <w:t>O gráfico de Avaliação Diagnóstica - Farol aparece somente no mini currículo do diretor, como linha de quatro períodos, com cada ponto na cor da faixa vermelho, amarelo ou verde; o histórico usado no protótipo é demonstrativo</w:t>
+              <w:t>O gráfico de Avaliação Diagnóstica - Farol aparece somente no mini currículo do diretor, com quatro barras e uma linha ligando os pontos no topo; cada barra e ponto usam a cor da faixa vermelho, amarelo ou verde, e o histórico usado no protótipo é demonstrativo</w:t>
             </w:r>
           </w:p>
         </w:tc>

</xml_diff>

<commit_message>
Estiliza decisoes do diretor com cores e joinhas
</commit_message>
<xml_diff>
--- a/PRD – Escola SP Conecta.docx
+++ b/PRD – Escola SP Conecta.docx
@@ -1134,7 +1134,7 @@
         </w:numPr>
       </w:pPr>
       <w:r>
-        <w:t>Ações rápidas Conectar e Passar direto na linha</w:t>
+        <w:t>Ações rápidas na linha: Conectar em verde com joinha para cima (👍) e Passar em vermelho com joinha para baixo (👎)</w:t>
       </w:r>
     </w:p>
     <w:p>
@@ -1450,7 +1450,7 @@
         <w:t>Conectar</w:t>
       </w:r>
       <w:r>
-        <w:t xml:space="preserve"> (primário) e </w:t>
+        <w:t xml:space="preserve"> em verde com 👍 e </w:t>
       </w:r>
       <w:r>
         <w:rPr>
@@ -1459,7 +1459,7 @@
         <w:t>Passar</w:t>
       </w:r>
       <w:r>
-        <w:t xml:space="preserve"> (secundário), com setas para ir ao próximo/anterior candidato sem voltar à lista.</w:t>
+        <w:t xml:space="preserve"> em vermelho com 👎, com setas para ir ao próximo/anterior candidato sem voltar à lista.</w:t>
       </w:r>
     </w:p>
     <w:p>
@@ -2311,7 +2311,7 @@
     </w:p>
     <w:sectPr>
       <w:pgSz w:w="12240" w:h="15840"/>
-      <w:pgMar w:top="1440" w:right="1440" w:bottom="1440" w:left="1440" w:header="720" w:footer="720" w:gutter="0"/>
+      <w:pgMar w:top="1134" w:right="1440" w:bottom="1020" w:left="1440" w:header="720" w:footer="720" w:gutter="0"/>
     </w:sectPr>
   </w:body>
 </w:document>

</xml_diff>

<commit_message>
Confirma decisoes do diretor e renomeia nao conectar
</commit_message>
<xml_diff>
--- a/PRD – Escola SP Conecta.docx
+++ b/PRD – Escola SP Conecta.docx
@@ -477,7 +477,7 @@
           <w:p>
             <w:pPr/>
             <w:r>
-              <w:t xml:space="preserve">Status</w:t>
+              <w:t>Status</w:t>
             </w:r>
           </w:p>
         </w:tc>
@@ -489,7 +489,7 @@
           <w:p>
             <w:pPr/>
             <w:r>
-              <w:t xml:space="preserve">Quando aparece</w:t>
+              <w:t>Quando aparece</w:t>
             </w:r>
           </w:p>
         </w:tc>
@@ -613,7 +613,7 @@
         </w:numPr>
       </w:pPr>
       <w:r>
-        <w:t>O professor não vê quais diretores clicaram em Passar</w:t>
+        <w:t>O professor não vê quais diretores clicaram em Não conectar</w:t>
       </w:r>
     </w:p>
     <w:p>
@@ -713,7 +713,7 @@
     <w:p>
       <w:pPr/>
       <w:r>
-        <w:t>O diretor vê em lista todos os professores que escolheram a sua escola, abre o mini currículo e decide entre Conectar e Passar.</w:t>
+        <w:t>O diretor vê em lista todos os professores que escolheram a sua escola, abre o mini currículo e decide entre Conectar e Não conectar.</w:t>
       </w:r>
     </w:p>
     <w:p>
@@ -740,7 +740,7 @@
         <w:t xml:space="preserve">Acesso: </w:t>
       </w:r>
       <w:r>
-        <w:t>entra pela SED e vê um painel da sua escola com o total de candidatos, quantos já foram conectados ou passados e quantos estão pendentes. No protótipo, seleciona a escola do diretor para simular mais de uma escola.</w:t>
+        <w:t>entra pela SED e vê um painel da sua escola com o total de candidatos, quantos já foram conectados ou não conectados e quantos estão pendentes. No protótipo, seleciona a escola do diretor para simular mais de uma escola.</w:t>
       </w:r>
     </w:p>
     <w:p>
@@ -794,7 +794,7 @@
         <w:t>Decisão:</w:t>
       </w:r>
       <w:r>
-        <w:t xml:space="preserve"> clica em Conectar ou Passar, sem justificativa.</w:t>
+        <w:t xml:space="preserve"> clica em Conectar ou Não conectar, confirma a escolha antes do registro e não precisa informar justificativa.</w:t>
       </w:r>
     </w:p>
     <w:p>
@@ -848,7 +848,7 @@
           <w:p>
             <w:pPr/>
             <w:r>
-              <w:t xml:space="preserve">Coluna</w:t>
+              <w:t>Coluna</w:t>
             </w:r>
           </w:p>
         </w:tc>
@@ -860,7 +860,7 @@
           <w:p>
             <w:pPr/>
             <w:r>
-              <w:t xml:space="preserve">Observação</w:t>
+              <w:t>Observação</w:t>
             </w:r>
           </w:p>
         </w:tc>
@@ -876,7 +876,7 @@
           <w:p>
             <w:pPr/>
             <w:r>
-              <w:t xml:space="preserve">Foto (miniatura)</w:t>
+              <w:t>Foto (miniatura)</w:t>
             </w:r>
           </w:p>
         </w:tc>
@@ -887,7 +887,7 @@
           <w:p>
             <w:pPr/>
             <w:r>
-              <w:t xml:space="preserve">Avatar circular</w:t>
+              <w:t>Avatar circular</w:t>
             </w:r>
           </w:p>
         </w:tc>
@@ -903,7 +903,7 @@
           <w:p>
             <w:pPr/>
             <w:r>
-              <w:t xml:space="preserve">Nome</w:t>
+              <w:t>Nome</w:t>
             </w:r>
           </w:p>
         </w:tc>
@@ -914,7 +914,7 @@
           <w:p>
             <w:pPr/>
             <w:r>
-              <w:t xml:space="preserve">Link para o mini currículo</w:t>
+              <w:t>Link para o mini currículo</w:t>
             </w:r>
           </w:p>
         </w:tc>
@@ -930,7 +930,7 @@
           <w:p>
             <w:pPr/>
             <w:r>
-              <w:t xml:space="preserve">Cargo</w:t>
+              <w:t>Cargo</w:t>
             </w:r>
           </w:p>
         </w:tc>
@@ -954,7 +954,7 @@
           <w:p>
             <w:pPr/>
             <w:r>
-              <w:t xml:space="preserve">Categoria</w:t>
+              <w:t>Categoria</w:t>
             </w:r>
           </w:p>
         </w:tc>
@@ -965,7 +965,7 @@
           <w:p>
             <w:pPr/>
             <w:r>
-              <w:t xml:space="preserve">O, Efetivo, OFA etc.</w:t>
+              <w:t>O, Efetivo, OFA etc.</w:t>
             </w:r>
           </w:p>
         </w:tc>
@@ -1006,7 +1006,7 @@
           <w:p>
             <w:pPr/>
             <w:r>
-              <w:t xml:space="preserve">Farol</w:t>
+              <w:t>Farol</w:t>
             </w:r>
           </w:p>
         </w:tc>
@@ -1017,7 +1017,7 @@
           <w:p>
             <w:pPr/>
             <w:r>
-              <w:t xml:space="preserve">Ícone vermelho / amarelo / verde</w:t>
+              <w:t>Ícone vermelho / amarelo / verde</w:t>
             </w:r>
           </w:p>
         </w:tc>
@@ -1033,7 +1033,7 @@
           <w:p>
             <w:pPr/>
             <w:r>
-              <w:t xml:space="preserve">PEI</w:t>
+              <w:t>PEI</w:t>
             </w:r>
           </w:p>
         </w:tc>
@@ -1044,7 +1044,7 @@
           <w:p>
             <w:pPr/>
             <w:r>
-              <w:t xml:space="preserve">Credenciado sim/não</w:t>
+              <w:t>Credenciado sim/não</w:t>
             </w:r>
           </w:p>
         </w:tc>
@@ -1060,7 +1060,7 @@
           <w:p>
             <w:pPr/>
             <w:r>
-              <w:t xml:space="preserve">Nota final</w:t>
+              <w:t>Nota final</w:t>
             </w:r>
           </w:p>
         </w:tc>
@@ -1084,7 +1084,7 @@
           <w:p>
             <w:pPr/>
             <w:r>
-              <w:t xml:space="preserve">Decisão</w:t>
+              <w:t>Decisão</w:t>
             </w:r>
           </w:p>
         </w:tc>
@@ -1095,7 +1095,7 @@
           <w:p>
             <w:pPr/>
             <w:r>
-              <w:t xml:space="preserve">Pendente / Conectado / Passado</w:t>
+              <w:t>Pendente / Conectado / Não conectado</w:t>
             </w:r>
           </w:p>
         </w:tc>
@@ -1134,7 +1134,7 @@
         </w:numPr>
       </w:pPr>
       <w:r>
-        <w:t>Ações rápidas na linha: Conectar em verde com joinha para cima (👍) e Passar em vermelho com joinha para baixo (👎)</w:t>
+        <w:t>Ações rápidas na linha: Conectar em verde com joinha para cima (👍) e Não conectar em vermelho com joinha para baixo (👎)</w:t>
       </w:r>
     </w:p>
     <w:p>
@@ -1456,7 +1456,7 @@
         <w:rPr>
           <w:b/>
         </w:rPr>
-        <w:t>Passar</w:t>
+        <w:t>Não conectar</w:t>
       </w:r>
       <w:r>
         <w:t xml:space="preserve"> em vermelho com 👎, com setas para ir ao próximo/anterior candidato sem voltar à lista.</w:t>
@@ -1545,7 +1545,10 @@
       </w:pPr>
       <w:r>
         <w:rPr/>
-        <w:t>O diretor marca Conectar ou Passar para cada professor. Ao encerrar o prazo dos diretores, o sistema percorre a lista de escolas do professor em ordem de prioridade e define a primeira que marcou Conectar. Se a primeira não o conectou, tenta a segunda e assim por diante. Antes do encerramento, o professor vê Em análise. Se nenhuma escola o conectou, mostra Sem conexão; o encaminhamento posterior permanece em aberto.</w:t>
+        <w:t>O diretor marca Conectar ou Não conectar para cada professor. Ao encerrar o prazo dos diretores, o sistema percorre a lista de escolas do professor em ordem de prioridade e define a primeira que marcou Conectar. Se a primeira não o conectou, tenta a segunda e assim por diante. Antes do encerramento, o professor vê Em análise. Se nenhuma escola o conectou, mostra Sem conexão; o encaminhamento posterior permanece em aberto.</w:t>
+      </w:r>
+      <w:r>
+        <w:t xml:space="preserve"> O sistema pede confirmação antes de gravar a decisão; se ele cancelar, a decisão anterior permanece.</w:t>
       </w:r>
     </w:p>
     <w:tbl>
@@ -1578,7 +1581,7 @@
               <w:rPr>
                 <w:sz w:val="17"/>
               </w:rPr>
-              <w:t xml:space="preserve">#</w:t>
+              <w:t>#</w:t>
             </w:r>
           </w:p>
         </w:tc>
@@ -1595,139 +1598,139 @@
               <w:rPr>
                 <w:sz w:val="17"/>
               </w:rPr>
-              <w:t xml:space="preserve">Regra</w:t>
-            </w:r>
-          </w:p>
-        </w:tc>
-      </w:tr>
-      <w:tr>
-        <w:trPr>
-          <w:cantSplit/>
-        </w:trPr>
-        <w:tc>
-          <w:tcPr>
-            <w:tcW w:w="4680" w:type="dxa"/>
-          </w:tcPr>
-          <w:p>
-            <w:pPr>
-              <w:spacing w:before="0" w:after="0" w:line="240" w:lineRule="auto"/>
-            </w:pPr>
-            <w:r>
-              <w:rPr>
-                <w:sz w:val="17"/>
-              </w:rPr>
-              <w:t xml:space="preserve">RN01</w:t>
-            </w:r>
-          </w:p>
-        </w:tc>
-        <w:tc>
-          <w:tcPr>
-            <w:tcW w:w="4680" w:type="dxa"/>
-          </w:tcPr>
-          <w:p>
-            <w:pPr>
-              <w:spacing w:before="0" w:after="0" w:line="240" w:lineRule="auto"/>
-            </w:pPr>
-            <w:r>
-              <w:rPr>
-                <w:sz w:val="17"/>
-              </w:rPr>
-              <w:t xml:space="preserve">Participam: farol vermelho, farol amarelo indicado à não permanência, Categoria O, novíssimos, efetivos adidos e OFA adidos</w:t>
-            </w:r>
-          </w:p>
-        </w:tc>
-      </w:tr>
-      <w:tr>
-        <w:trPr>
-          <w:cantSplit/>
-        </w:trPr>
-        <w:tc>
-          <w:tcPr>
-            <w:tcW w:w="4680" w:type="dxa"/>
-          </w:tcPr>
-          <w:p>
-            <w:pPr>
-              <w:spacing w:before="0" w:after="0" w:line="240" w:lineRule="auto"/>
-            </w:pPr>
-            <w:r>
-              <w:rPr>
-                <w:sz w:val="17"/>
-              </w:rPr>
-              <w:t xml:space="preserve">RN02</w:t>
-            </w:r>
-          </w:p>
-        </w:tc>
-        <w:tc>
-          <w:tcPr>
-            <w:tcW w:w="4680" w:type="dxa"/>
-          </w:tcPr>
-          <w:p>
-            <w:pPr>
-              <w:spacing w:before="0" w:after="0" w:line="240" w:lineRule="auto"/>
-            </w:pPr>
-            <w:r>
-              <w:rPr>
-                <w:sz w:val="17"/>
-              </w:rPr>
-              <w:t xml:space="preserve">Não há entrevista nem atribuição em nível de diretoria</w:t>
-            </w:r>
-          </w:p>
-        </w:tc>
-      </w:tr>
-      <w:tr>
-        <w:trPr>
-          <w:cantSplit/>
-        </w:trPr>
-        <w:tc>
-          <w:tcPr>
-            <w:tcW w:w="4680" w:type="dxa"/>
-          </w:tcPr>
-          <w:p>
-            <w:pPr>
-              <w:spacing w:before="0" w:after="0" w:line="240" w:lineRule="auto"/>
-            </w:pPr>
-            <w:r>
-              <w:rPr>
-                <w:sz w:val="17"/>
-              </w:rPr>
-              <w:t xml:space="preserve">RN03</w:t>
-            </w:r>
-          </w:p>
-        </w:tc>
-        <w:tc>
-          <w:tcPr>
-            <w:tcW w:w="4680" w:type="dxa"/>
-          </w:tcPr>
-          <w:p>
-            <w:pPr>
-              <w:spacing w:before="0" w:after="0" w:line="240" w:lineRule="auto"/>
-            </w:pPr>
-            <w:r>
-              <w:rPr>
-                <w:sz w:val="17"/>
-              </w:rPr>
-              <w:t xml:space="preserve">Todo participante escolhe de 1 a 20 escolas, de qualquer diretoria</w:t>
-            </w:r>
-          </w:p>
-        </w:tc>
-      </w:tr>
-      <w:tr>
-        <w:trPr>
-          <w:cantSplit/>
-        </w:trPr>
-        <w:tc>
-          <w:tcPr>
-            <w:tcW w:w="4680" w:type="dxa"/>
-          </w:tcPr>
-          <w:p>
-            <w:pPr>
-              <w:spacing w:before="0" w:after="0" w:line="240" w:lineRule="auto"/>
-            </w:pPr>
-            <w:r>
-              <w:rPr>
-                <w:sz w:val="17"/>
-              </w:rPr>
-              <w:t xml:space="preserve">RN05</w:t>
+              <w:t>Regra</w:t>
+            </w:r>
+          </w:p>
+        </w:tc>
+      </w:tr>
+      <w:tr>
+        <w:trPr>
+          <w:cantSplit/>
+        </w:trPr>
+        <w:tc>
+          <w:tcPr>
+            <w:tcW w:w="4680" w:type="dxa"/>
+          </w:tcPr>
+          <w:p>
+            <w:pPr>
+              <w:spacing w:before="0" w:after="0" w:line="240" w:lineRule="auto"/>
+            </w:pPr>
+            <w:r>
+              <w:rPr>
+                <w:sz w:val="17"/>
+              </w:rPr>
+              <w:t>RN01</w:t>
+            </w:r>
+          </w:p>
+        </w:tc>
+        <w:tc>
+          <w:tcPr>
+            <w:tcW w:w="4680" w:type="dxa"/>
+          </w:tcPr>
+          <w:p>
+            <w:pPr>
+              <w:spacing w:before="0" w:after="0" w:line="240" w:lineRule="auto"/>
+            </w:pPr>
+            <w:r>
+              <w:rPr>
+                <w:sz w:val="17"/>
+              </w:rPr>
+              <w:t>Participam: farol vermelho, farol amarelo indicado à não permanência, Categoria O, novíssimos, efetivos adidos e OFA adidos</w:t>
+            </w:r>
+          </w:p>
+        </w:tc>
+      </w:tr>
+      <w:tr>
+        <w:trPr>
+          <w:cantSplit/>
+        </w:trPr>
+        <w:tc>
+          <w:tcPr>
+            <w:tcW w:w="4680" w:type="dxa"/>
+          </w:tcPr>
+          <w:p>
+            <w:pPr>
+              <w:spacing w:before="0" w:after="0" w:line="240" w:lineRule="auto"/>
+            </w:pPr>
+            <w:r>
+              <w:rPr>
+                <w:sz w:val="17"/>
+              </w:rPr>
+              <w:t>RN02</w:t>
+            </w:r>
+          </w:p>
+        </w:tc>
+        <w:tc>
+          <w:tcPr>
+            <w:tcW w:w="4680" w:type="dxa"/>
+          </w:tcPr>
+          <w:p>
+            <w:pPr>
+              <w:spacing w:before="0" w:after="0" w:line="240" w:lineRule="auto"/>
+            </w:pPr>
+            <w:r>
+              <w:rPr>
+                <w:sz w:val="17"/>
+              </w:rPr>
+              <w:t>Não há entrevista nem atribuição em nível de diretoria</w:t>
+            </w:r>
+          </w:p>
+        </w:tc>
+      </w:tr>
+      <w:tr>
+        <w:trPr>
+          <w:cantSplit/>
+        </w:trPr>
+        <w:tc>
+          <w:tcPr>
+            <w:tcW w:w="4680" w:type="dxa"/>
+          </w:tcPr>
+          <w:p>
+            <w:pPr>
+              <w:spacing w:before="0" w:after="0" w:line="240" w:lineRule="auto"/>
+            </w:pPr>
+            <w:r>
+              <w:rPr>
+                <w:sz w:val="17"/>
+              </w:rPr>
+              <w:t>RN03</w:t>
+            </w:r>
+          </w:p>
+        </w:tc>
+        <w:tc>
+          <w:tcPr>
+            <w:tcW w:w="4680" w:type="dxa"/>
+          </w:tcPr>
+          <w:p>
+            <w:pPr>
+              <w:spacing w:before="0" w:after="0" w:line="240" w:lineRule="auto"/>
+            </w:pPr>
+            <w:r>
+              <w:rPr>
+                <w:sz w:val="17"/>
+              </w:rPr>
+              <w:t>Todo participante escolhe de 1 a 20 escolas, de qualquer diretoria</w:t>
+            </w:r>
+          </w:p>
+        </w:tc>
+      </w:tr>
+      <w:tr>
+        <w:trPr>
+          <w:cantSplit/>
+        </w:trPr>
+        <w:tc>
+          <w:tcPr>
+            <w:tcW w:w="4680" w:type="dxa"/>
+          </w:tcPr>
+          <w:p>
+            <w:pPr>
+              <w:spacing w:before="0" w:after="0" w:line="240" w:lineRule="auto"/>
+            </w:pPr>
+            <w:r>
+              <w:rPr>
+                <w:sz w:val="17"/>
+              </w:rPr>
+              <w:t>RN05</w:t>
             </w:r>
           </w:p>
         </w:tc>
@@ -1764,44 +1767,44 @@
               <w:rPr>
                 <w:sz w:val="17"/>
               </w:rPr>
-              <w:t xml:space="preserve">RN06</w:t>
-            </w:r>
-          </w:p>
-        </w:tc>
-        <w:tc>
-          <w:tcPr>
-            <w:tcW w:w="4680" w:type="dxa"/>
-          </w:tcPr>
-          <w:p>
-            <w:pPr>
-              <w:spacing w:before="0" w:after="0" w:line="240" w:lineRule="auto"/>
-            </w:pPr>
-            <w:r>
-              <w:rPr>
-                <w:sz w:val="17"/>
-              </w:rPr>
-              <w:t xml:space="preserve">O diretor decide entre Conectar e Passar, sem justificativa</w:t>
-            </w:r>
-          </w:p>
-        </w:tc>
-      </w:tr>
-      <w:tr>
-        <w:trPr>
-          <w:cantSplit/>
-        </w:trPr>
-        <w:tc>
-          <w:tcPr>
-            <w:tcW w:w="4680" w:type="dxa"/>
-          </w:tcPr>
-          <w:p>
-            <w:pPr>
-              <w:spacing w:before="0" w:after="0" w:line="240" w:lineRule="auto"/>
-            </w:pPr>
-            <w:r>
-              <w:rPr>
-                <w:sz w:val="17"/>
-              </w:rPr>
-              <w:t xml:space="preserve">RN07</w:t>
+              <w:t>RN06</w:t>
+            </w:r>
+          </w:p>
+        </w:tc>
+        <w:tc>
+          <w:tcPr>
+            <w:tcW w:w="4680" w:type="dxa"/>
+          </w:tcPr>
+          <w:p>
+            <w:pPr>
+              <w:spacing w:before="0" w:after="0" w:line="240" w:lineRule="auto"/>
+            </w:pPr>
+            <w:r>
+              <w:rPr>
+                <w:sz w:val="17"/>
+              </w:rPr>
+              <w:t>O diretor decide entre Conectar e Não conectar, sem justificativa</w:t>
+            </w:r>
+          </w:p>
+        </w:tc>
+      </w:tr>
+      <w:tr>
+        <w:trPr>
+          <w:cantSplit/>
+        </w:trPr>
+        <w:tc>
+          <w:tcPr>
+            <w:tcW w:w="4680" w:type="dxa"/>
+          </w:tcPr>
+          <w:p>
+            <w:pPr>
+              <w:spacing w:before="0" w:after="0" w:line="240" w:lineRule="auto"/>
+            </w:pPr>
+            <w:r>
+              <w:rPr>
+                <w:sz w:val="17"/>
+              </w:rPr>
+              <w:t>RN07</w:t>
             </w:r>
           </w:p>
         </w:tc>
@@ -1838,7 +1841,7 @@
               <w:rPr>
                 <w:sz w:val="17"/>
               </w:rPr>
-              <w:t xml:space="preserve">RN08</w:t>
+              <w:t>RN08</w:t>
             </w:r>
           </w:p>
         </w:tc>
@@ -1875,60 +1878,60 @@
               <w:rPr>
                 <w:sz w:val="17"/>
               </w:rPr>
-              <w:t xml:space="preserve">RN09</w:t>
-            </w:r>
-          </w:p>
-        </w:tc>
-        <w:tc>
-          <w:tcPr>
-            <w:tcW w:w="4680" w:type="dxa"/>
-          </w:tcPr>
-          <w:p>
-            <w:pPr>
-              <w:spacing w:before="0" w:after="0" w:line="240" w:lineRule="auto"/>
-            </w:pPr>
-            <w:r>
-              <w:rPr>
-                <w:sz w:val="17"/>
-              </w:rPr>
-              <w:t xml:space="preserve">Escolas PEI só podem ser escolhidas por professores credenciados</w:t>
-            </w:r>
-          </w:p>
-        </w:tc>
-      </w:tr>
-      <w:tr>
-        <w:trPr>
-          <w:cantSplit/>
-        </w:trPr>
-        <w:tc>
-          <w:tcPr>
-            <w:tcW w:w="4680" w:type="dxa"/>
-          </w:tcPr>
-          <w:p>
-            <w:pPr>
-              <w:spacing w:before="0" w:after="0" w:line="240" w:lineRule="auto"/>
-            </w:pPr>
-            <w:r>
-              <w:rPr>
-                <w:sz w:val="17"/>
-              </w:rPr>
-              <w:t xml:space="preserve">RN10</w:t>
-            </w:r>
-          </w:p>
-        </w:tc>
-        <w:tc>
-          <w:tcPr>
-            <w:tcW w:w="4680" w:type="dxa"/>
-          </w:tcPr>
-          <w:p>
-            <w:pPr>
-              <w:spacing w:before="0" w:after="0" w:line="240" w:lineRule="auto"/>
-            </w:pPr>
-            <w:r>
-              <w:rPr>
-                <w:sz w:val="17"/>
-              </w:rPr>
-              <w:t xml:space="preserve">CPF exibido sempre mascarado</w:t>
+              <w:t>RN09</w:t>
+            </w:r>
+          </w:p>
+        </w:tc>
+        <w:tc>
+          <w:tcPr>
+            <w:tcW w:w="4680" w:type="dxa"/>
+          </w:tcPr>
+          <w:p>
+            <w:pPr>
+              <w:spacing w:before="0" w:after="0" w:line="240" w:lineRule="auto"/>
+            </w:pPr>
+            <w:r>
+              <w:rPr>
+                <w:sz w:val="17"/>
+              </w:rPr>
+              <w:t>Escolas PEI só podem ser escolhidas por professores credenciados</w:t>
+            </w:r>
+          </w:p>
+        </w:tc>
+      </w:tr>
+      <w:tr>
+        <w:trPr>
+          <w:cantSplit/>
+        </w:trPr>
+        <w:tc>
+          <w:tcPr>
+            <w:tcW w:w="4680" w:type="dxa"/>
+          </w:tcPr>
+          <w:p>
+            <w:pPr>
+              <w:spacing w:before="0" w:after="0" w:line="240" w:lineRule="auto"/>
+            </w:pPr>
+            <w:r>
+              <w:rPr>
+                <w:sz w:val="17"/>
+              </w:rPr>
+              <w:t>RN10</w:t>
+            </w:r>
+          </w:p>
+        </w:tc>
+        <w:tc>
+          <w:tcPr>
+            <w:tcW w:w="4680" w:type="dxa"/>
+          </w:tcPr>
+          <w:p>
+            <w:pPr>
+              <w:spacing w:before="0" w:after="0" w:line="240" w:lineRule="auto"/>
+            </w:pPr>
+            <w:r>
+              <w:rPr>
+                <w:sz w:val="17"/>
+              </w:rPr>
+              <w:t>CPF exibido sempre mascarado</w:t>
             </w:r>
           </w:p>
         </w:tc>

</xml_diff>